<commit_message>
Check employee passwords through the employee API
AccountService keeps the shared steps (find QPS user, lockout, failure count,
disabled check) and delegates the password check to ICredentialVerifier:
vendors use the stored hash, employees call IEmployeeAuthApi (user name +
password). API errors or timeouts show "temporarily unavailable" and are not
counted as failures. Failed attempts are padded to 1 s so timing doesn't
reveal which step failed.

Co-Authored-By: Claude Opus 5.5 <noreply@anthropic.com>
Claude-Session: https://claude.ai/code/session_018MfMkgbxtZVjZcM4YyFHwE
</commit_message>
<xml_diff>
--- a/docs/QPS-Implementation-Guide.docx
+++ b/docs/QPS-Implementation-Guide.docx
@@ -2485,7 +2485,7 @@
           <w:sz w:val="18"/>
           <w:szCs w:val="18"/>
         </w:rPr>
-        <w:t xml:space="preserve">AccountService</w:t>
+        <w:t xml:space="preserve">VendorPasswordVerifier</w:t>
       </w:r>
       <w:r>
         <w:t xml:space="preserve"> calls </w:t>
@@ -3162,6 +3162,27 @@
           <w:szCs w:val="16"/>
         </w:rPr>
         <w:t xml:space="preserve">builder.Services.AddScoped&lt;IAuthEmailSender, QpsAuthEmailSender&gt;();   // Step 10 (dev: LoggingAuthEmailSender)</w:t>
+      </w:r>
+    </w:p>
+    <w:p>
+      <w:pPr>
+        <w:keepNext/>
+        <w:keepLines/>
+        <w:pBdr>
+          <w:left w:val="single" w:color="D6DBE4" w:sz="4"/>
+          <w:right w:val="single" w:color="D6DBE4" w:sz="4"/>
+        </w:pBdr>
+        <w:shd w:fill="EEF1F6" w:color="auto" w:val="clear"/>
+        <w:spacing w:after="0" w:line="250"/>
+        <w:ind w:left="120" w:right="120"/>
+      </w:pPr>
+      <w:r>
+        <w:rPr>
+          <w:rFonts w:ascii="Consolas" w:cs="Consolas" w:eastAsia="Consolas" w:hAnsi="Consolas"/>
+          <w:sz w:val="16"/>
+          <w:szCs w:val="16"/>
+        </w:rPr>
+        <w:t xml:space="preserve">builder.Services.AddScoped&lt;IEmployeeAuthApi, QpsEmployeeAuthApi&gt;();   // Step 9b (dev: DevEmployeeAuthApi)</w:t>
       </w:r>
     </w:p>
     <w:p>
@@ -5392,55 +5413,7 @@
                 <w:sz w:val="19"/>
                 <w:szCs w:val="19"/>
               </w:rPr>
-              <w:t xml:space="preserve">Employees: if their password is checked by the HRP/COP APIs rather than a stored hash, </w:t>
-            </w:r>
-            <w:r>
-              <w:rPr>
-                <w:rFonts w:ascii="Consolas" w:cs="Consolas" w:eastAsia="Consolas" w:hAnsi="Consolas"/>
-                <w:color w:val="2B3442"/>
-                <w:sz w:val="19"/>
-                <w:szCs w:val="19"/>
-              </w:rPr>
-              <w:t xml:space="preserve">AccountService.ValidateCredentialsAsync</w:t>
-            </w:r>
-            <w:r>
-              <w:rPr>
-                <w:sz w:val="19"/>
-                <w:szCs w:val="19"/>
-              </w:rPr>
-              <w:t xml:space="preserve"> needs a branch for </w:t>
-            </w:r>
-            <w:r>
-              <w:rPr>
-                <w:rFonts w:ascii="Consolas" w:cs="Consolas" w:eastAsia="Consolas" w:hAnsi="Consolas"/>
-                <w:color w:val="2B3442"/>
-                <w:sz w:val="19"/>
-                <w:szCs w:val="19"/>
-              </w:rPr>
-              <w:t xml:space="preserve">AccountType.Employee</w:t>
-            </w:r>
-            <w:r>
-              <w:rPr>
-                <w:sz w:val="19"/>
-                <w:szCs w:val="19"/>
-              </w:rPr>
-              <w:t xml:space="preserve"> that calls that API instead of </w:t>
-            </w:r>
-            <w:r>
-              <w:rPr>
-                <w:rFonts w:ascii="Consolas" w:cs="Consolas" w:eastAsia="Consolas" w:hAnsi="Consolas"/>
-                <w:color w:val="2B3442"/>
-                <w:sz w:val="19"/>
-                <w:szCs w:val="19"/>
-              </w:rPr>
-              <w:t xml:space="preserve">VerifyPassword</w:t>
-            </w:r>
-            <w:r>
-              <w:rPr>
-                <w:sz w:val="19"/>
-                <w:szCs w:val="19"/>
-              </w:rPr>
-              <w:t xml:space="preserve">. Keep the rest (CAPTCHA, lockout, ticket) the same. Vendors: </w:t>
+              <w:t xml:space="preserve">Employees are not checked against a stored hash: their row in QPS gives roles, modules, status and lockout, and the password goes to the employee API (Step 9b). Vendors: </w:t>
             </w:r>
             <w:r>
               <w:rPr>
@@ -5511,6 +5484,1041 @@
       </w:r>
       <w:r>
         <w:t xml:space="preserve"> already creates a fresh scope for each check.</w:t>
+      </w:r>
+    </w:p>
+    <w:p>
+      <w:pPr>
+        <w:pStyle w:val="Heading2"/>
+        <w:keepNext/>
+      </w:pPr>
+      <w:r>
+        <w:t xml:space="preserve">Step 9b — Employee API (IEmployeeAuthApi)</w:t>
+      </w:r>
+    </w:p>
+    <w:p>
+      <w:pPr>
+        <w:spacing w:after="120" w:line="300"/>
+      </w:pPr>
+      <w:r>
+        <w:t xml:space="preserve">Employees sign in with their company password, checked by the employee API (two parameters in, the user out). Only the password check differs from vendors:</w:t>
+      </w:r>
+    </w:p>
+    <w:tbl>
+      <w:tblPr>
+        <w:tblW w:type="dxa" w:w="9026"/>
+        <w:tblBorders>
+          <w:top w:val="single" w:color="auto" w:sz="4"/>
+          <w:left w:val="single" w:color="auto" w:sz="4"/>
+          <w:bottom w:val="single" w:color="auto" w:sz="4"/>
+          <w:right w:val="single" w:color="auto" w:sz="4"/>
+          <w:insideH w:val="single" w:color="auto" w:sz="4"/>
+          <w:insideV w:val="single" w:color="auto" w:sz="4"/>
+        </w:tblBorders>
+      </w:tblPr>
+      <w:tblGrid>
+        <w:gridCol w:w="2400"/>
+        <w:gridCol w:w="3313"/>
+        <w:gridCol w:w="3313"/>
+      </w:tblGrid>
+      <w:tr>
+        <w:trPr>
+          <w:tblHeader/>
+        </w:trPr>
+        <w:tc>
+          <w:tcPr>
+            <w:tcW w:type="dxa" w:w="2400"/>
+            <w:tcBorders>
+              <w:top w:val="single" w:color="D6DBE4" w:sz="4"/>
+              <w:left w:val="single" w:color="D6DBE4" w:sz="4"/>
+              <w:bottom w:val="single" w:color="D6DBE4" w:sz="4"/>
+              <w:right w:val="single" w:color="D6DBE4" w:sz="4"/>
+            </w:tcBorders>
+            <w:shd w:fill="EEF1F6" w:color="auto" w:val="clear"/>
+            <w:tcMar>
+              <w:top w:type="dxa" w:w="70"/>
+              <w:left w:type="dxa" w:w="100"/>
+              <w:bottom w:type="dxa" w:w="70"/>
+              <w:right w:type="dxa" w:w="100"/>
+            </w:tcMar>
+          </w:tcPr>
+          <w:p>
+            <w:r>
+              <w:rPr>
+                <w:b/>
+                <w:bCs/>
+                <w:caps/>
+                <w:color w:val="586274"/>
+                <w:sz w:val="17"/>
+                <w:szCs w:val="17"/>
+              </w:rPr>
+              <w:t xml:space="preserve">Step</w:t>
+            </w:r>
+          </w:p>
+        </w:tc>
+        <w:tc>
+          <w:tcPr>
+            <w:tcW w:type="dxa" w:w="3313"/>
+            <w:tcBorders>
+              <w:top w:val="single" w:color="D6DBE4" w:sz="4"/>
+              <w:left w:val="single" w:color="D6DBE4" w:sz="4"/>
+              <w:bottom w:val="single" w:color="D6DBE4" w:sz="4"/>
+              <w:right w:val="single" w:color="D6DBE4" w:sz="4"/>
+            </w:tcBorders>
+            <w:shd w:fill="EEF1F6" w:color="auto" w:val="clear"/>
+            <w:tcMar>
+              <w:top w:type="dxa" w:w="70"/>
+              <w:left w:type="dxa" w:w="100"/>
+              <w:bottom w:type="dxa" w:w="70"/>
+              <w:right w:type="dxa" w:w="100"/>
+            </w:tcMar>
+          </w:tcPr>
+          <w:p>
+            <w:r>
+              <w:rPr>
+                <w:b/>
+                <w:bCs/>
+                <w:caps/>
+                <w:color w:val="586274"/>
+                <w:sz w:val="17"/>
+                <w:szCs w:val="17"/>
+              </w:rPr>
+              <w:t xml:space="preserve">Vendor</w:t>
+            </w:r>
+          </w:p>
+        </w:tc>
+        <w:tc>
+          <w:tcPr>
+            <w:tcW w:type="dxa" w:w="3313"/>
+            <w:tcBorders>
+              <w:top w:val="single" w:color="D6DBE4" w:sz="4"/>
+              <w:left w:val="single" w:color="D6DBE4" w:sz="4"/>
+              <w:bottom w:val="single" w:color="D6DBE4" w:sz="4"/>
+              <w:right w:val="single" w:color="D6DBE4" w:sz="4"/>
+            </w:tcBorders>
+            <w:shd w:fill="EEF1F6" w:color="auto" w:val="clear"/>
+            <w:tcMar>
+              <w:top w:type="dxa" w:w="70"/>
+              <w:left w:type="dxa" w:w="100"/>
+              <w:bottom w:type="dxa" w:w="70"/>
+              <w:right w:type="dxa" w:w="100"/>
+            </w:tcMar>
+          </w:tcPr>
+          <w:p>
+            <w:r>
+              <w:rPr>
+                <w:b/>
+                <w:bCs/>
+                <w:caps/>
+                <w:color w:val="586274"/>
+                <w:sz w:val="17"/>
+                <w:szCs w:val="17"/>
+              </w:rPr>
+              <w:t xml:space="preserve">Employee</w:t>
+            </w:r>
+          </w:p>
+        </w:tc>
+      </w:tr>
+      <w:tr>
+        <w:trPr>
+          <w:cantSplit/>
+        </w:trPr>
+        <w:tc>
+          <w:tcPr>
+            <w:tcW w:type="dxa" w:w="2400"/>
+            <w:tcBorders>
+              <w:top w:val="single" w:color="D6DBE4" w:sz="4"/>
+              <w:left w:val="single" w:color="D6DBE4" w:sz="4"/>
+              <w:bottom w:val="single" w:color="D6DBE4" w:sz="4"/>
+              <w:right w:val="single" w:color="D6DBE4" w:sz="4"/>
+            </w:tcBorders>
+            <w:tcMar>
+              <w:top w:type="dxa" w:w="70"/>
+              <w:left w:type="dxa" w:w="100"/>
+              <w:bottom w:type="dxa" w:w="70"/>
+              <w:right w:type="dxa" w:w="100"/>
+            </w:tcMar>
+          </w:tcPr>
+          <w:p>
+            <w:r>
+              <w:rPr>
+                <w:sz w:val="19"/>
+                <w:szCs w:val="19"/>
+              </w:rPr>
+              <w:t xml:space="preserve">1. Find user</w:t>
+            </w:r>
+          </w:p>
+        </w:tc>
+        <w:tc>
+          <w:tcPr>
+            <w:tcW w:type="dxa" w:w="3313"/>
+            <w:tcBorders>
+              <w:top w:val="single" w:color="D6DBE4" w:sz="4"/>
+              <w:left w:val="single" w:color="D6DBE4" w:sz="4"/>
+              <w:bottom w:val="single" w:color="D6DBE4" w:sz="4"/>
+              <w:right w:val="single" w:color="D6DBE4" w:sz="4"/>
+            </w:tcBorders>
+            <w:tcMar>
+              <w:top w:type="dxa" w:w="70"/>
+              <w:left w:type="dxa" w:w="100"/>
+              <w:bottom w:type="dxa" w:w="70"/>
+              <w:right w:type="dxa" w:w="100"/>
+            </w:tcMar>
+          </w:tcPr>
+          <w:p>
+            <w:r>
+              <w:rPr>
+                <w:sz w:val="19"/>
+                <w:szCs w:val="19"/>
+              </w:rPr>
+              <w:t xml:space="preserve">QPS vendor row</w:t>
+            </w:r>
+          </w:p>
+        </w:tc>
+        <w:tc>
+          <w:tcPr>
+            <w:tcW w:type="dxa" w:w="3313"/>
+            <w:tcBorders>
+              <w:top w:val="single" w:color="D6DBE4" w:sz="4"/>
+              <w:left w:val="single" w:color="D6DBE4" w:sz="4"/>
+              <w:bottom w:val="single" w:color="D6DBE4" w:sz="4"/>
+              <w:right w:val="single" w:color="D6DBE4" w:sz="4"/>
+            </w:tcBorders>
+            <w:tcMar>
+              <w:top w:type="dxa" w:w="70"/>
+              <w:left w:type="dxa" w:w="100"/>
+              <w:bottom w:type="dxa" w:w="70"/>
+              <w:right w:type="dxa" w:w="100"/>
+            </w:tcMar>
+          </w:tcPr>
+          <w:p>
+            <w:r>
+              <w:rPr>
+                <w:sz w:val="19"/>
+                <w:szCs w:val="19"/>
+              </w:rPr>
+              <w:t xml:space="preserve">QPS user row (roles, modules, active, lockout)</w:t>
+            </w:r>
+          </w:p>
+        </w:tc>
+      </w:tr>
+      <w:tr>
+        <w:trPr>
+          <w:cantSplit/>
+        </w:trPr>
+        <w:tc>
+          <w:tcPr>
+            <w:tcW w:type="dxa" w:w="2400"/>
+            <w:tcBorders>
+              <w:top w:val="single" w:color="D6DBE4" w:sz="4"/>
+              <w:left w:val="single" w:color="D6DBE4" w:sz="4"/>
+              <w:bottom w:val="single" w:color="D6DBE4" w:sz="4"/>
+              <w:right w:val="single" w:color="D6DBE4" w:sz="4"/>
+            </w:tcBorders>
+            <w:tcMar>
+              <w:top w:type="dxa" w:w="70"/>
+              <w:left w:type="dxa" w:w="100"/>
+              <w:bottom w:type="dxa" w:w="70"/>
+              <w:right w:type="dxa" w:w="100"/>
+            </w:tcMar>
+          </w:tcPr>
+          <w:p>
+            <w:r>
+              <w:rPr>
+                <w:sz w:val="19"/>
+                <w:szCs w:val="19"/>
+              </w:rPr>
+              <w:t xml:space="preserve">2. Locked out?</w:t>
+            </w:r>
+          </w:p>
+        </w:tc>
+        <w:tc>
+          <w:tcPr>
+            <w:tcW w:type="dxa" w:w="3313"/>
+            <w:tcBorders>
+              <w:top w:val="single" w:color="D6DBE4" w:sz="4"/>
+              <w:left w:val="single" w:color="D6DBE4" w:sz="4"/>
+              <w:bottom w:val="single" w:color="D6DBE4" w:sz="4"/>
+              <w:right w:val="single" w:color="D6DBE4" w:sz="4"/>
+            </w:tcBorders>
+            <w:tcMar>
+              <w:top w:type="dxa" w:w="70"/>
+              <w:left w:type="dxa" w:w="100"/>
+              <w:bottom w:type="dxa" w:w="70"/>
+              <w:right w:type="dxa" w:w="100"/>
+            </w:tcMar>
+          </w:tcPr>
+          <w:p>
+            <w:r>
+              <w:rPr>
+                <w:sz w:val="19"/>
+                <w:szCs w:val="19"/>
+              </w:rPr>
+              <w:t xml:space="preserve">Refuse</w:t>
+            </w:r>
+          </w:p>
+        </w:tc>
+        <w:tc>
+          <w:tcPr>
+            <w:tcW w:type="dxa" w:w="3313"/>
+            <w:tcBorders>
+              <w:top w:val="single" w:color="D6DBE4" w:sz="4"/>
+              <w:left w:val="single" w:color="D6DBE4" w:sz="4"/>
+              <w:bottom w:val="single" w:color="D6DBE4" w:sz="4"/>
+              <w:right w:val="single" w:color="D6DBE4" w:sz="4"/>
+            </w:tcBorders>
+            <w:tcMar>
+              <w:top w:type="dxa" w:w="70"/>
+              <w:left w:type="dxa" w:w="100"/>
+              <w:bottom w:type="dxa" w:w="70"/>
+              <w:right w:type="dxa" w:w="100"/>
+            </w:tcMar>
+          </w:tcPr>
+          <w:p>
+            <w:r>
+              <w:rPr>
+                <w:sz w:val="19"/>
+                <w:szCs w:val="19"/>
+              </w:rPr>
+              <w:t xml:space="preserve">Refuse — API not called</w:t>
+            </w:r>
+          </w:p>
+        </w:tc>
+      </w:tr>
+      <w:tr>
+        <w:trPr>
+          <w:cantSplit/>
+        </w:trPr>
+        <w:tc>
+          <w:tcPr>
+            <w:tcW w:type="dxa" w:w="2400"/>
+            <w:tcBorders>
+              <w:top w:val="single" w:color="D6DBE4" w:sz="4"/>
+              <w:left w:val="single" w:color="D6DBE4" w:sz="4"/>
+              <w:bottom w:val="single" w:color="D6DBE4" w:sz="4"/>
+              <w:right w:val="single" w:color="D6DBE4" w:sz="4"/>
+            </w:tcBorders>
+            <w:tcMar>
+              <w:top w:type="dxa" w:w="70"/>
+              <w:left w:type="dxa" w:w="100"/>
+              <w:bottom w:type="dxa" w:w="70"/>
+              <w:right w:type="dxa" w:w="100"/>
+            </w:tcMar>
+          </w:tcPr>
+          <w:p>
+            <w:r>
+              <w:rPr>
+                <w:sz w:val="19"/>
+                <w:szCs w:val="19"/>
+              </w:rPr>
+              <w:t xml:space="preserve">3. Check password</w:t>
+            </w:r>
+          </w:p>
+        </w:tc>
+        <w:tc>
+          <w:tcPr>
+            <w:tcW w:type="dxa" w:w="3313"/>
+            <w:tcBorders>
+              <w:top w:val="single" w:color="D6DBE4" w:sz="4"/>
+              <w:left w:val="single" w:color="D6DBE4" w:sz="4"/>
+              <w:bottom w:val="single" w:color="D6DBE4" w:sz="4"/>
+              <w:right w:val="single" w:color="D6DBE4" w:sz="4"/>
+            </w:tcBorders>
+            <w:tcMar>
+              <w:top w:type="dxa" w:w="70"/>
+              <w:left w:type="dxa" w:w="100"/>
+              <w:bottom w:type="dxa" w:w="70"/>
+              <w:right w:type="dxa" w:w="100"/>
+            </w:tcMar>
+          </w:tcPr>
+          <w:p>
+            <w:r>
+              <w:rPr>
+                <w:rFonts w:ascii="Consolas" w:cs="Consolas" w:eastAsia="Consolas" w:hAnsi="Consolas"/>
+                <w:color w:val="2B3442"/>
+                <w:sz w:val="19"/>
+                <w:szCs w:val="19"/>
+              </w:rPr>
+              <w:t xml:space="preserve">VendorPasswordVerifier</w:t>
+            </w:r>
+            <w:r>
+              <w:rPr>
+                <w:sz w:val="19"/>
+                <w:szCs w:val="19"/>
+              </w:rPr>
+              <w:t xml:space="preserve"> → </w:t>
+            </w:r>
+            <w:r>
+              <w:rPr>
+                <w:rFonts w:ascii="Consolas" w:cs="Consolas" w:eastAsia="Consolas" w:hAnsi="Consolas"/>
+                <w:color w:val="2B3442"/>
+                <w:sz w:val="19"/>
+                <w:szCs w:val="19"/>
+              </w:rPr>
+              <w:t xml:space="preserve">VerifyPassword</w:t>
+            </w:r>
+          </w:p>
+        </w:tc>
+        <w:tc>
+          <w:tcPr>
+            <w:tcW w:type="dxa" w:w="3313"/>
+            <w:tcBorders>
+              <w:top w:val="single" w:color="D6DBE4" w:sz="4"/>
+              <w:left w:val="single" w:color="D6DBE4" w:sz="4"/>
+              <w:bottom w:val="single" w:color="D6DBE4" w:sz="4"/>
+              <w:right w:val="single" w:color="D6DBE4" w:sz="4"/>
+            </w:tcBorders>
+            <w:tcMar>
+              <w:top w:type="dxa" w:w="70"/>
+              <w:left w:type="dxa" w:w="100"/>
+              <w:bottom w:type="dxa" w:w="70"/>
+              <w:right w:type="dxa" w:w="100"/>
+            </w:tcMar>
+          </w:tcPr>
+          <w:p>
+            <w:r>
+              <w:rPr>
+                <w:rFonts w:ascii="Consolas" w:cs="Consolas" w:eastAsia="Consolas" w:hAnsi="Consolas"/>
+                <w:color w:val="2B3442"/>
+                <w:sz w:val="19"/>
+                <w:szCs w:val="19"/>
+              </w:rPr>
+              <w:t xml:space="preserve">EmployeeApiVerifier</w:t>
+            </w:r>
+            <w:r>
+              <w:rPr>
+                <w:sz w:val="19"/>
+                <w:szCs w:val="19"/>
+              </w:rPr>
+              <w:t xml:space="preserve"> → </w:t>
+            </w:r>
+            <w:r>
+              <w:rPr>
+                <w:rFonts w:ascii="Consolas" w:cs="Consolas" w:eastAsia="Consolas" w:hAnsi="Consolas"/>
+                <w:color w:val="2B3442"/>
+                <w:sz w:val="19"/>
+                <w:szCs w:val="19"/>
+              </w:rPr>
+              <w:t xml:space="preserve">IEmployeeAuthApi.AuthenticateAsync</w:t>
+            </w:r>
+          </w:p>
+        </w:tc>
+      </w:tr>
+      <w:tr>
+        <w:trPr>
+          <w:cantSplit/>
+        </w:trPr>
+        <w:tc>
+          <w:tcPr>
+            <w:tcW w:type="dxa" w:w="2400"/>
+            <w:tcBorders>
+              <w:top w:val="single" w:color="D6DBE4" w:sz="4"/>
+              <w:left w:val="single" w:color="D6DBE4" w:sz="4"/>
+              <w:bottom w:val="single" w:color="D6DBE4" w:sz="4"/>
+              <w:right w:val="single" w:color="D6DBE4" w:sz="4"/>
+            </w:tcBorders>
+            <w:tcMar>
+              <w:top w:type="dxa" w:w="70"/>
+              <w:left w:type="dxa" w:w="100"/>
+              <w:bottom w:type="dxa" w:w="70"/>
+              <w:right w:type="dxa" w:w="100"/>
+            </w:tcMar>
+          </w:tcPr>
+          <w:p>
+            <w:r>
+              <w:rPr>
+                <w:sz w:val="19"/>
+                <w:szCs w:val="19"/>
+              </w:rPr>
+              <w:t xml:space="preserve">4. Wrong password</w:t>
+            </w:r>
+          </w:p>
+        </w:tc>
+        <w:tc>
+          <w:tcPr>
+            <w:tcW w:type="dxa" w:w="3313"/>
+            <w:tcBorders>
+              <w:top w:val="single" w:color="D6DBE4" w:sz="4"/>
+              <w:left w:val="single" w:color="D6DBE4" w:sz="4"/>
+              <w:bottom w:val="single" w:color="D6DBE4" w:sz="4"/>
+              <w:right w:val="single" w:color="D6DBE4" w:sz="4"/>
+            </w:tcBorders>
+            <w:tcMar>
+              <w:top w:type="dxa" w:w="70"/>
+              <w:left w:type="dxa" w:w="100"/>
+              <w:bottom w:type="dxa" w:w="70"/>
+              <w:right w:type="dxa" w:w="100"/>
+            </w:tcMar>
+          </w:tcPr>
+          <w:p>
+            <w:r>
+              <w:rPr>
+                <w:sz w:val="19"/>
+                <w:szCs w:val="19"/>
+              </w:rPr>
+              <w:t xml:space="preserve">Count; lock after 5</w:t>
+            </w:r>
+          </w:p>
+        </w:tc>
+        <w:tc>
+          <w:tcPr>
+            <w:tcW w:type="dxa" w:w="3313"/>
+            <w:tcBorders>
+              <w:top w:val="single" w:color="D6DBE4" w:sz="4"/>
+              <w:left w:val="single" w:color="D6DBE4" w:sz="4"/>
+              <w:bottom w:val="single" w:color="D6DBE4" w:sz="4"/>
+              <w:right w:val="single" w:color="D6DBE4" w:sz="4"/>
+            </w:tcBorders>
+            <w:tcMar>
+              <w:top w:type="dxa" w:w="70"/>
+              <w:left w:type="dxa" w:w="100"/>
+              <w:bottom w:type="dxa" w:w="70"/>
+              <w:right w:type="dxa" w:w="100"/>
+            </w:tcMar>
+          </w:tcPr>
+          <w:p>
+            <w:r>
+              <w:rPr>
+                <w:sz w:val="19"/>
+                <w:szCs w:val="19"/>
+              </w:rPr>
+              <w:t xml:space="preserve">Same</w:t>
+            </w:r>
+          </w:p>
+        </w:tc>
+      </w:tr>
+      <w:tr>
+        <w:trPr>
+          <w:cantSplit/>
+        </w:trPr>
+        <w:tc>
+          <w:tcPr>
+            <w:tcW w:type="dxa" w:w="2400"/>
+            <w:tcBorders>
+              <w:top w:val="single" w:color="D6DBE4" w:sz="4"/>
+              <w:left w:val="single" w:color="D6DBE4" w:sz="4"/>
+              <w:bottom w:val="single" w:color="D6DBE4" w:sz="4"/>
+              <w:right w:val="single" w:color="D6DBE4" w:sz="4"/>
+            </w:tcBorders>
+            <w:tcMar>
+              <w:top w:type="dxa" w:w="70"/>
+              <w:left w:type="dxa" w:w="100"/>
+              <w:bottom w:type="dxa" w:w="70"/>
+              <w:right w:type="dxa" w:w="100"/>
+            </w:tcMar>
+          </w:tcPr>
+          <w:p>
+            <w:r>
+              <w:rPr>
+                <w:sz w:val="19"/>
+                <w:szCs w:val="19"/>
+              </w:rPr>
+              <w:t xml:space="preserve">5. Disabled in QPS?</w:t>
+            </w:r>
+          </w:p>
+        </w:tc>
+        <w:tc>
+          <w:tcPr>
+            <w:tcW w:type="dxa" w:w="3313"/>
+            <w:tcBorders>
+              <w:top w:val="single" w:color="D6DBE4" w:sz="4"/>
+              <w:left w:val="single" w:color="D6DBE4" w:sz="4"/>
+              <w:bottom w:val="single" w:color="D6DBE4" w:sz="4"/>
+              <w:right w:val="single" w:color="D6DBE4" w:sz="4"/>
+            </w:tcBorders>
+            <w:tcMar>
+              <w:top w:type="dxa" w:w="70"/>
+              <w:left w:type="dxa" w:w="100"/>
+              <w:bottom w:type="dxa" w:w="70"/>
+              <w:right w:type="dxa" w:w="100"/>
+            </w:tcMar>
+          </w:tcPr>
+          <w:p>
+            <w:r>
+              <w:rPr>
+                <w:sz w:val="19"/>
+                <w:szCs w:val="19"/>
+              </w:rPr>
+              <w:t xml:space="preserve">Refuse</w:t>
+            </w:r>
+          </w:p>
+        </w:tc>
+        <w:tc>
+          <w:tcPr>
+            <w:tcW w:type="dxa" w:w="3313"/>
+            <w:tcBorders>
+              <w:top w:val="single" w:color="D6DBE4" w:sz="4"/>
+              <w:left w:val="single" w:color="D6DBE4" w:sz="4"/>
+              <w:bottom w:val="single" w:color="D6DBE4" w:sz="4"/>
+              <w:right w:val="single" w:color="D6DBE4" w:sz="4"/>
+            </w:tcBorders>
+            <w:tcMar>
+              <w:top w:type="dxa" w:w="70"/>
+              <w:left w:type="dxa" w:w="100"/>
+              <w:bottom w:type="dxa" w:w="70"/>
+              <w:right w:type="dxa" w:w="100"/>
+            </w:tcMar>
+          </w:tcPr>
+          <w:p>
+            <w:r>
+              <w:rPr>
+                <w:sz w:val="19"/>
+                <w:szCs w:val="19"/>
+              </w:rPr>
+              <w:t xml:space="preserve">Refuse</w:t>
+            </w:r>
+          </w:p>
+        </w:tc>
+      </w:tr>
+      <w:tr>
+        <w:trPr>
+          <w:cantSplit/>
+        </w:trPr>
+        <w:tc>
+          <w:tcPr>
+            <w:tcW w:type="dxa" w:w="2400"/>
+            <w:tcBorders>
+              <w:top w:val="single" w:color="D6DBE4" w:sz="4"/>
+              <w:left w:val="single" w:color="D6DBE4" w:sz="4"/>
+              <w:bottom w:val="single" w:color="D6DBE4" w:sz="4"/>
+              <w:right w:val="single" w:color="D6DBE4" w:sz="4"/>
+            </w:tcBorders>
+            <w:tcMar>
+              <w:top w:type="dxa" w:w="70"/>
+              <w:left w:type="dxa" w:w="100"/>
+              <w:bottom w:type="dxa" w:w="70"/>
+              <w:right w:type="dxa" w:w="100"/>
+            </w:tcMar>
+          </w:tcPr>
+          <w:p>
+            <w:r>
+              <w:rPr>
+                <w:sz w:val="19"/>
+                <w:szCs w:val="19"/>
+              </w:rPr>
+              <w:t xml:space="preserve">6. Success</w:t>
+            </w:r>
+          </w:p>
+        </w:tc>
+        <w:tc>
+          <w:tcPr>
+            <w:tcW w:type="dxa" w:w="3313"/>
+            <w:tcBorders>
+              <w:top w:val="single" w:color="D6DBE4" w:sz="4"/>
+              <w:left w:val="single" w:color="D6DBE4" w:sz="4"/>
+              <w:bottom w:val="single" w:color="D6DBE4" w:sz="4"/>
+              <w:right w:val="single" w:color="D6DBE4" w:sz="4"/>
+            </w:tcBorders>
+            <w:tcMar>
+              <w:top w:type="dxa" w:w="70"/>
+              <w:left w:type="dxa" w:w="100"/>
+              <w:bottom w:type="dxa" w:w="70"/>
+              <w:right w:type="dxa" w:w="100"/>
+            </w:tcMar>
+          </w:tcPr>
+          <w:p>
+            <w:r>
+              <w:rPr>
+                <w:sz w:val="19"/>
+                <w:szCs w:val="19"/>
+              </w:rPr>
+              <w:t xml:space="preserve">Ticket → cookie</w:t>
+            </w:r>
+          </w:p>
+        </w:tc>
+        <w:tc>
+          <w:tcPr>
+            <w:tcW w:type="dxa" w:w="3313"/>
+            <w:tcBorders>
+              <w:top w:val="single" w:color="D6DBE4" w:sz="4"/>
+              <w:left w:val="single" w:color="D6DBE4" w:sz="4"/>
+              <w:bottom w:val="single" w:color="D6DBE4" w:sz="4"/>
+              <w:right w:val="single" w:color="D6DBE4" w:sz="4"/>
+            </w:tcBorders>
+            <w:tcMar>
+              <w:top w:type="dxa" w:w="70"/>
+              <w:left w:type="dxa" w:w="100"/>
+              <w:bottom w:type="dxa" w:w="70"/>
+              <w:right w:type="dxa" w:w="100"/>
+            </w:tcMar>
+          </w:tcPr>
+          <w:p>
+            <w:r>
+              <w:rPr>
+                <w:sz w:val="19"/>
+                <w:szCs w:val="19"/>
+              </w:rPr>
+              <w:t xml:space="preserve">Same</w:t>
+            </w:r>
+          </w:p>
+        </w:tc>
+      </w:tr>
+    </w:tbl>
+    <w:p>
+      <w:pPr>
+        <w:spacing w:after="120"/>
+      </w:pPr>
+    </w:p>
+    <w:p>
+      <w:pPr>
+        <w:keepNext/>
+        <w:keepLines/>
+        <w:pBdr>
+          <w:top w:val="single" w:color="D6DBE4" w:sz="4"/>
+          <w:left w:val="single" w:color="D6DBE4" w:sz="4"/>
+          <w:right w:val="single" w:color="D6DBE4" w:sz="4"/>
+        </w:pBdr>
+        <w:shd w:fill="EEF1F6" w:color="auto" w:val="clear"/>
+        <w:spacing w:after="0" w:line="250"/>
+        <w:ind w:left="120" w:right="120"/>
+      </w:pPr>
+      <w:r>
+        <w:rPr>
+          <w:rFonts w:ascii="Consolas" w:cs="Consolas" w:eastAsia="Consolas" w:hAnsi="Consolas"/>
+          <w:sz w:val="16"/>
+          <w:szCs w:val="16"/>
+        </w:rPr>
+        <w:t xml:space="preserve">public sealed class QpsEmployeeAuthApi(/* your API client */) : IEmployeeAuthApi</w:t>
+      </w:r>
+    </w:p>
+    <w:p>
+      <w:pPr>
+        <w:keepNext/>
+        <w:keepLines/>
+        <w:pBdr>
+          <w:left w:val="single" w:color="D6DBE4" w:sz="4"/>
+          <w:right w:val="single" w:color="D6DBE4" w:sz="4"/>
+        </w:pBdr>
+        <w:shd w:fill="EEF1F6" w:color="auto" w:val="clear"/>
+        <w:spacing w:after="0" w:line="250"/>
+        <w:ind w:left="120" w:right="120"/>
+      </w:pPr>
+      <w:r>
+        <w:rPr>
+          <w:rFonts w:ascii="Consolas" w:cs="Consolas" w:eastAsia="Consolas" w:hAnsi="Consolas"/>
+          <w:sz w:val="16"/>
+          <w:szCs w:val="16"/>
+        </w:rPr>
+        <w:t xml:space="preserve">{</w:t>
+      </w:r>
+    </w:p>
+    <w:p>
+      <w:pPr>
+        <w:keepNext/>
+        <w:keepLines/>
+        <w:pBdr>
+          <w:left w:val="single" w:color="D6DBE4" w:sz="4"/>
+          <w:right w:val="single" w:color="D6DBE4" w:sz="4"/>
+        </w:pBdr>
+        <w:shd w:fill="EEF1F6" w:color="auto" w:val="clear"/>
+        <w:spacing w:after="0" w:line="250"/>
+        <w:ind w:left="120" w:right="120"/>
+      </w:pPr>
+      <w:r>
+        <w:rPr>
+          <w:rFonts w:ascii="Consolas" w:cs="Consolas" w:eastAsia="Consolas" w:hAnsi="Consolas"/>
+          <w:sz w:val="16"/>
+          <w:szCs w:val="16"/>
+        </w:rPr>
+        <w:t xml:space="preserve">    public async Task&lt;EmployeeApiUser?&gt; AuthenticateAsync(string userName, string password, CancellationToken ct = default)</w:t>
+      </w:r>
+    </w:p>
+    <w:p>
+      <w:pPr>
+        <w:keepNext/>
+        <w:keepLines/>
+        <w:pBdr>
+          <w:left w:val="single" w:color="D6DBE4" w:sz="4"/>
+          <w:right w:val="single" w:color="D6DBE4" w:sz="4"/>
+        </w:pBdr>
+        <w:shd w:fill="EEF1F6" w:color="auto" w:val="clear"/>
+        <w:spacing w:after="0" w:line="250"/>
+        <w:ind w:left="120" w:right="120"/>
+      </w:pPr>
+      <w:r>
+        <w:rPr>
+          <w:rFonts w:ascii="Consolas" w:cs="Consolas" w:eastAsia="Consolas" w:hAnsi="Consolas"/>
+          <w:sz w:val="16"/>
+          <w:szCs w:val="16"/>
+        </w:rPr>
+        <w:t xml:space="preserve">    {</w:t>
+      </w:r>
+    </w:p>
+    <w:p>
+      <w:pPr>
+        <w:keepNext/>
+        <w:keepLines/>
+        <w:pBdr>
+          <w:left w:val="single" w:color="D6DBE4" w:sz="4"/>
+          <w:right w:val="single" w:color="D6DBE4" w:sz="4"/>
+        </w:pBdr>
+        <w:shd w:fill="EEF1F6" w:color="auto" w:val="clear"/>
+        <w:spacing w:after="0" w:line="250"/>
+        <w:ind w:left="120" w:right="120"/>
+      </w:pPr>
+      <w:r>
+        <w:rPr>
+          <w:rFonts w:ascii="Consolas" w:cs="Consolas" w:eastAsia="Consolas" w:hAnsi="Consolas"/>
+          <w:sz w:val="16"/>
+          <w:szCs w:val="16"/>
+        </w:rPr>
+        <w:t xml:space="preserve">        var response = await api.CallingAPI&lt;EmployeeLoginRes, EmployeeLoginReq&gt;(</w:t>
+      </w:r>
+    </w:p>
+    <w:p>
+      <w:pPr>
+        <w:keepNext/>
+        <w:keepLines/>
+        <w:pBdr>
+          <w:left w:val="single" w:color="D6DBE4" w:sz="4"/>
+          <w:right w:val="single" w:color="D6DBE4" w:sz="4"/>
+        </w:pBdr>
+        <w:shd w:fill="EEF1F6" w:color="auto" w:val="clear"/>
+        <w:spacing w:after="0" w:line="250"/>
+        <w:ind w:left="120" w:right="120"/>
+      </w:pPr>
+      <w:r>
+        <w:rPr>
+          <w:rFonts w:ascii="Consolas" w:cs="Consolas" w:eastAsia="Consolas" w:hAnsi="Consolas"/>
+          <w:sz w:val="16"/>
+          <w:szCs w:val="16"/>
+        </w:rPr>
+        <w:t xml:space="preserve">            AllApiNames.EmployeeLogin, new EmployeeLoginReq(userName, password));</w:t>
+      </w:r>
+    </w:p>
+    <w:p>
+      <w:pPr>
+        <w:keepNext/>
+        <w:keepLines/>
+        <w:pBdr>
+          <w:left w:val="single" w:color="D6DBE4" w:sz="4"/>
+          <w:right w:val="single" w:color="D6DBE4" w:sz="4"/>
+        </w:pBdr>
+        <w:shd w:fill="EEF1F6" w:color="auto" w:val="clear"/>
+        <w:spacing w:after="0" w:line="250"/>
+        <w:ind w:left="120" w:right="120"/>
+      </w:pPr>
+      <w:r>
+        <w:rPr>
+          <w:rFonts w:ascii="Consolas" w:cs="Consolas" w:eastAsia="Consolas" w:hAnsi="Consolas"/>
+          <w:sz w:val="16"/>
+          <w:szCs w:val="16"/>
+        </w:rPr>
+        <w:t xml:space="preserve">        if (response is null)</w:t>
+      </w:r>
+    </w:p>
+    <w:p>
+      <w:pPr>
+        <w:keepNext/>
+        <w:keepLines/>
+        <w:pBdr>
+          <w:left w:val="single" w:color="D6DBE4" w:sz="4"/>
+          <w:right w:val="single" w:color="D6DBE4" w:sz="4"/>
+        </w:pBdr>
+        <w:shd w:fill="EEF1F6" w:color="auto" w:val="clear"/>
+        <w:spacing w:after="0" w:line="250"/>
+        <w:ind w:left="120" w:right="120"/>
+      </w:pPr>
+      <w:r>
+        <w:rPr>
+          <w:rFonts w:ascii="Consolas" w:cs="Consolas" w:eastAsia="Consolas" w:hAnsi="Consolas"/>
+          <w:sz w:val="16"/>
+          <w:szCs w:val="16"/>
+        </w:rPr>
+        <w:t xml:space="preserve">            throw new HttpRequestException("Employee API returned nothing");   // → "temporarily unavailable"</w:t>
+      </w:r>
+    </w:p>
+    <w:p>
+      <w:pPr>
+        <w:keepNext/>
+        <w:keepLines/>
+        <w:pBdr>
+          <w:left w:val="single" w:color="D6DBE4" w:sz="4"/>
+          <w:right w:val="single" w:color="D6DBE4" w:sz="4"/>
+        </w:pBdr>
+        <w:shd w:fill="EEF1F6" w:color="auto" w:val="clear"/>
+        <w:spacing w:after="0" w:line="250"/>
+        <w:ind w:left="120" w:right="120"/>
+      </w:pPr>
+      <w:r>
+        <w:rPr>
+          <w:rFonts w:ascii="Consolas" w:cs="Consolas" w:eastAsia="Consolas" w:hAnsi="Consolas"/>
+          <w:sz w:val="16"/>
+          <w:szCs w:val="16"/>
+        </w:rPr>
+        <w:t xml:space="preserve">        if (response.responseCode != 0)</w:t>
+      </w:r>
+    </w:p>
+    <w:p>
+      <w:pPr>
+        <w:keepNext/>
+        <w:keepLines/>
+        <w:pBdr>
+          <w:left w:val="single" w:color="D6DBE4" w:sz="4"/>
+          <w:right w:val="single" w:color="D6DBE4" w:sz="4"/>
+        </w:pBdr>
+        <w:shd w:fill="EEF1F6" w:color="auto" w:val="clear"/>
+        <w:spacing w:after="0" w:line="250"/>
+        <w:ind w:left="120" w:right="120"/>
+      </w:pPr>
+      <w:r>
+        <w:rPr>
+          <w:rFonts w:ascii="Consolas" w:cs="Consolas" w:eastAsia="Consolas" w:hAnsi="Consolas"/>
+          <w:sz w:val="16"/>
+          <w:szCs w:val="16"/>
+        </w:rPr>
+        <w:t xml:space="preserve">            return null;                                                     // wrong user name / password</w:t>
+      </w:r>
+    </w:p>
+    <w:p>
+      <w:pPr>
+        <w:keepNext/>
+        <w:keepLines/>
+        <w:pBdr>
+          <w:left w:val="single" w:color="D6DBE4" w:sz="4"/>
+          <w:right w:val="single" w:color="D6DBE4" w:sz="4"/>
+        </w:pBdr>
+        <w:shd w:fill="EEF1F6" w:color="auto" w:val="clear"/>
+        <w:spacing w:after="0" w:line="250"/>
+        <w:ind w:left="120" w:right="120"/>
+      </w:pPr>
+      <w:r>
+        <w:rPr>
+          <w:rFonts w:ascii="Consolas" w:cs="Consolas" w:eastAsia="Consolas" w:hAnsi="Consolas"/>
+          <w:sz w:val="16"/>
+          <w:szCs w:val="16"/>
+        </w:rPr>
+        <w:t xml:space="preserve">        return new EmployeeApiUser(response.ApiData.EmpCode, response.ApiData.Name, response.ApiData.Email);</w:t>
+      </w:r>
+    </w:p>
+    <w:p>
+      <w:pPr>
+        <w:keepNext/>
+        <w:keepLines/>
+        <w:pBdr>
+          <w:left w:val="single" w:color="D6DBE4" w:sz="4"/>
+          <w:right w:val="single" w:color="D6DBE4" w:sz="4"/>
+        </w:pBdr>
+        <w:shd w:fill="EEF1F6" w:color="auto" w:val="clear"/>
+        <w:spacing w:after="0" w:line="250"/>
+        <w:ind w:left="120" w:right="120"/>
+      </w:pPr>
+      <w:r>
+        <w:rPr>
+          <w:rFonts w:ascii="Consolas" w:cs="Consolas" w:eastAsia="Consolas" w:hAnsi="Consolas"/>
+          <w:sz w:val="16"/>
+          <w:szCs w:val="16"/>
+        </w:rPr>
+        <w:t xml:space="preserve">    }</w:t>
+      </w:r>
+    </w:p>
+    <w:p>
+      <w:pPr>
+        <w:keepNext w:val="false"/>
+        <w:keepLines/>
+        <w:pBdr>
+          <w:bottom w:val="single" w:color="D6DBE4" w:sz="4"/>
+          <w:left w:val="single" w:color="D6DBE4" w:sz="4"/>
+          <w:right w:val="single" w:color="D6DBE4" w:sz="4"/>
+        </w:pBdr>
+        <w:shd w:fill="EEF1F6" w:color="auto" w:val="clear"/>
+        <w:spacing w:after="0" w:line="250"/>
+        <w:ind w:left="120" w:right="120"/>
+      </w:pPr>
+      <w:r>
+        <w:rPr>
+          <w:rFonts w:ascii="Consolas" w:cs="Consolas" w:eastAsia="Consolas" w:hAnsi="Consolas"/>
+          <w:sz w:val="16"/>
+          <w:szCs w:val="16"/>
+        </w:rPr>
+        <w:t xml:space="preserve">}</w:t>
+      </w:r>
+    </w:p>
+    <w:p>
+      <w:pPr>
+        <w:spacing w:after="120"/>
+      </w:pPr>
+    </w:p>
+    <w:p>
+      <w:pPr>
+        <w:pStyle w:val="ListParagraph"/>
+        <w:numPr>
+          <w:ilvl w:val="0"/>
+          <w:numId w:val="2"/>
+        </w:numPr>
+        <w:spacing w:after="90" w:line="290"/>
+      </w:pPr>
+      <w:r>
+        <w:t xml:space="preserve">Return </w:t>
+      </w:r>
+      <w:r>
+        <w:rPr>
+          <w:b/>
+          <w:bCs/>
+        </w:rPr>
+        <w:t xml:space="preserve">null</w:t>
+      </w:r>
+      <w:r>
+        <w:t xml:space="preserve"> only for "wrong user name or password"; </w:t>
+      </w:r>
+      <w:r>
+        <w:rPr>
+          <w:b/>
+          <w:bCs/>
+        </w:rPr>
+        <w:t xml:space="preserve">throw</w:t>
+      </w:r>
+      <w:r>
+        <w:t xml:space="preserve"> for errors, so an API outage doesn't lock people out.</w:t>
+      </w:r>
+    </w:p>
+    <w:p>
+      <w:pPr>
+        <w:pStyle w:val="ListParagraph"/>
+        <w:numPr>
+          <w:ilvl w:val="0"/>
+          <w:numId w:val="2"/>
+        </w:numPr>
+        <w:spacing w:after="90" w:line="290"/>
+      </w:pPr>
+      <w:r>
+        <w:t xml:space="preserve">The returned employee code must equal the QPS user name, or the sign-in is rejected.</w:t>
+      </w:r>
+    </w:p>
+    <w:p>
+      <w:pPr>
+        <w:pStyle w:val="ListParagraph"/>
+        <w:numPr>
+          <w:ilvl w:val="0"/>
+          <w:numId w:val="2"/>
+        </w:numPr>
+        <w:spacing w:after="90" w:line="290"/>
+      </w:pPr>
+      <w:r>
+        <w:t xml:space="preserve">Employee rows need no </w:t>
+      </w:r>
+      <w:r>
+        <w:rPr>
+          <w:rFonts w:ascii="Consolas" w:cs="Consolas" w:eastAsia="Consolas" w:hAnsi="Consolas"/>
+          <w:color w:val="2B3442"/>
+          <w:sz w:val="18"/>
+          <w:szCs w:val="18"/>
+        </w:rPr>
+        <w:t xml:space="preserve">PasswordHash</w:t>
+      </w:r>
+      <w:r>
+        <w:t xml:space="preserve">, but still need a </w:t>
+      </w:r>
+      <w:r>
+        <w:rPr>
+          <w:rFonts w:ascii="Consolas" w:cs="Consolas" w:eastAsia="Consolas" w:hAnsi="Consolas"/>
+          <w:color w:val="2B3442"/>
+          <w:sz w:val="18"/>
+          <w:szCs w:val="18"/>
+        </w:rPr>
+        <w:t xml:space="preserve">SecurityStamp</w:t>
+      </w:r>
+      <w:r>
+        <w:t xml:space="preserve"> and the lockout columns.</w:t>
       </w:r>
     </w:p>
     <w:p>
@@ -7706,23 +8714,263 @@
                 <w:sz w:val="19"/>
                 <w:szCs w:val="19"/>
               </w:rPr>
-              <w:t xml:space="preserve">: store lookup, </w:t>
-            </w:r>
-            <w:r>
-              <w:rPr>
-                <w:rFonts w:ascii="Consolas" w:cs="Consolas" w:eastAsia="Consolas" w:hAnsi="Consolas"/>
-                <w:color w:val="2B3442"/>
-                <w:sz w:val="19"/>
-                <w:szCs w:val="19"/>
-              </w:rPr>
-              <w:t xml:space="preserve">VerifyPassword</w:t>
-            </w:r>
-            <w:r>
-              <w:rPr>
-                <w:sz w:val="19"/>
-                <w:szCs w:val="19"/>
-              </w:rPr>
-              <w:t xml:space="preserve">, lockout.</w:t>
+              <w:t xml:space="preserve">: store lookup, lockout, picks the </w:t>
+            </w:r>
+            <w:r>
+              <w:rPr>
+                <w:rFonts w:ascii="Consolas" w:cs="Consolas" w:eastAsia="Consolas" w:hAnsi="Consolas"/>
+                <w:color w:val="2B3442"/>
+                <w:sz w:val="19"/>
+                <w:szCs w:val="19"/>
+              </w:rPr>
+              <w:t xml:space="preserve">ICredentialVerifier</w:t>
+            </w:r>
+            <w:r>
+              <w:rPr>
+                <w:sz w:val="19"/>
+                <w:szCs w:val="19"/>
+              </w:rPr>
+              <w:t xml:space="preserve"> for the tab; failures take ≥ 1 s.</w:t>
+            </w:r>
+          </w:p>
+        </w:tc>
+      </w:tr>
+      <w:tr>
+        <w:trPr>
+          <w:cantSplit/>
+        </w:trPr>
+        <w:tc>
+          <w:tcPr>
+            <w:tcW w:type="dxa" w:w="2750"/>
+            <w:tcBorders>
+              <w:top w:val="single" w:color="D6DBE4" w:sz="4"/>
+              <w:left w:val="single" w:color="D6DBE4" w:sz="4"/>
+              <w:bottom w:val="single" w:color="D6DBE4" w:sz="4"/>
+              <w:right w:val="single" w:color="D6DBE4" w:sz="4"/>
+            </w:tcBorders>
+            <w:tcMar>
+              <w:top w:type="dxa" w:w="70"/>
+              <w:left w:type="dxa" w:w="100"/>
+              <w:bottom w:type="dxa" w:w="70"/>
+              <w:right w:type="dxa" w:w="100"/>
+            </w:tcMar>
+          </w:tcPr>
+          <w:p>
+            <w:r>
+              <w:rPr>
+                <w:rFonts w:ascii="Consolas" w:cs="Consolas" w:eastAsia="Consolas" w:hAnsi="Consolas"/>
+                <w:color w:val="2B3442"/>
+                <w:sz w:val="19"/>
+                <w:szCs w:val="19"/>
+              </w:rPr>
+              <w:t xml:space="preserve">Auth/CredentialVerifiers.cs</w:t>
+            </w:r>
+          </w:p>
+        </w:tc>
+        <w:tc>
+          <w:tcPr>
+            <w:tcW w:type="dxa" w:w="2400"/>
+            <w:tcBorders>
+              <w:top w:val="single" w:color="D6DBE4" w:sz="4"/>
+              <w:left w:val="single" w:color="D6DBE4" w:sz="4"/>
+              <w:bottom w:val="single" w:color="D6DBE4" w:sz="4"/>
+              <w:right w:val="single" w:color="D6DBE4" w:sz="4"/>
+            </w:tcBorders>
+            <w:tcMar>
+              <w:top w:type="dxa" w:w="70"/>
+              <w:left w:type="dxa" w:w="100"/>
+              <w:bottom w:type="dxa" w:w="70"/>
+              <w:right w:type="dxa" w:w="100"/>
+            </w:tcMar>
+          </w:tcPr>
+          <w:p>
+            <w:r>
+              <w:rPr>
+                <w:rFonts w:ascii="Consolas" w:cs="Consolas" w:eastAsia="Consolas" w:hAnsi="Consolas"/>
+                <w:color w:val="2B3442"/>
+                <w:sz w:val="19"/>
+                <w:szCs w:val="19"/>
+              </w:rPr>
+              <w:t xml:space="preserve">AccountService</w:t>
+            </w:r>
+          </w:p>
+        </w:tc>
+        <w:tc>
+          <w:tcPr>
+            <w:tcW w:type="dxa" w:w="3876"/>
+            <w:tcBorders>
+              <w:top w:val="single" w:color="D6DBE4" w:sz="4"/>
+              <w:left w:val="single" w:color="D6DBE4" w:sz="4"/>
+              <w:bottom w:val="single" w:color="D6DBE4" w:sz="4"/>
+              <w:right w:val="single" w:color="D6DBE4" w:sz="4"/>
+            </w:tcBorders>
+            <w:tcMar>
+              <w:top w:type="dxa" w:w="70"/>
+              <w:left w:type="dxa" w:w="100"/>
+              <w:bottom w:type="dxa" w:w="70"/>
+              <w:right w:type="dxa" w:w="100"/>
+            </w:tcMar>
+          </w:tcPr>
+          <w:p>
+            <w:r>
+              <w:rPr>
+                <w:rFonts w:ascii="Consolas" w:cs="Consolas" w:eastAsia="Consolas" w:hAnsi="Consolas"/>
+                <w:color w:val="2B3442"/>
+                <w:sz w:val="19"/>
+                <w:szCs w:val="19"/>
+              </w:rPr>
+              <w:t xml:space="preserve">VendorPasswordVerifier</w:t>
+            </w:r>
+            <w:r>
+              <w:rPr>
+                <w:sz w:val="19"/>
+                <w:szCs w:val="19"/>
+              </w:rPr>
+              <w:t xml:space="preserve"> (stored hash) and </w:t>
+            </w:r>
+            <w:r>
+              <w:rPr>
+                <w:rFonts w:ascii="Consolas" w:cs="Consolas" w:eastAsia="Consolas" w:hAnsi="Consolas"/>
+                <w:color w:val="2B3442"/>
+                <w:sz w:val="19"/>
+                <w:szCs w:val="19"/>
+              </w:rPr>
+              <w:t xml:space="preserve">EmployeeApiVerifier</w:t>
+            </w:r>
+            <w:r>
+              <w:rPr>
+                <w:sz w:val="19"/>
+                <w:szCs w:val="19"/>
+              </w:rPr>
+              <w:t xml:space="preserve"> (calls </w:t>
+            </w:r>
+            <w:r>
+              <w:rPr>
+                <w:rFonts w:ascii="Consolas" w:cs="Consolas" w:eastAsia="Consolas" w:hAnsi="Consolas"/>
+                <w:color w:val="2B3442"/>
+                <w:sz w:val="19"/>
+                <w:szCs w:val="19"/>
+              </w:rPr>
+              <w:t xml:space="preserve">IEmployeeAuthApi</w:t>
+            </w:r>
+            <w:r>
+              <w:rPr>
+                <w:sz w:val="19"/>
+                <w:szCs w:val="19"/>
+              </w:rPr>
+              <w:t xml:space="preserve">, 15 s timeout).</w:t>
+            </w:r>
+          </w:p>
+        </w:tc>
+      </w:tr>
+      <w:tr>
+        <w:trPr>
+          <w:cantSplit/>
+        </w:trPr>
+        <w:tc>
+          <w:tcPr>
+            <w:tcW w:type="dxa" w:w="2750"/>
+            <w:tcBorders>
+              <w:top w:val="single" w:color="D6DBE4" w:sz="4"/>
+              <w:left w:val="single" w:color="D6DBE4" w:sz="4"/>
+              <w:bottom w:val="single" w:color="D6DBE4" w:sz="4"/>
+              <w:right w:val="single" w:color="D6DBE4" w:sz="4"/>
+            </w:tcBorders>
+            <w:tcMar>
+              <w:top w:type="dxa" w:w="70"/>
+              <w:left w:type="dxa" w:w="100"/>
+              <w:bottom w:type="dxa" w:w="70"/>
+              <w:right w:type="dxa" w:w="100"/>
+            </w:tcMar>
+          </w:tcPr>
+          <w:p>
+            <w:r>
+              <w:rPr>
+                <w:rFonts w:ascii="Consolas" w:cs="Consolas" w:eastAsia="Consolas" w:hAnsi="Consolas"/>
+                <w:color w:val="2B3442"/>
+                <w:sz w:val="19"/>
+                <w:szCs w:val="19"/>
+              </w:rPr>
+              <w:t xml:space="preserve">Auth/IEmployeeAuthApi.cs</w:t>
+            </w:r>
+          </w:p>
+        </w:tc>
+        <w:tc>
+          <w:tcPr>
+            <w:tcW w:type="dxa" w:w="2400"/>
+            <w:tcBorders>
+              <w:top w:val="single" w:color="D6DBE4" w:sz="4"/>
+              <w:left w:val="single" w:color="D6DBE4" w:sz="4"/>
+              <w:bottom w:val="single" w:color="D6DBE4" w:sz="4"/>
+              <w:right w:val="single" w:color="D6DBE4" w:sz="4"/>
+            </w:tcBorders>
+            <w:tcMar>
+              <w:top w:type="dxa" w:w="70"/>
+              <w:left w:type="dxa" w:w="100"/>
+              <w:bottom w:type="dxa" w:w="70"/>
+              <w:right w:type="dxa" w:w="100"/>
+            </w:tcMar>
+          </w:tcPr>
+          <w:p>
+            <w:r>
+              <w:rPr>
+                <w:rFonts w:ascii="Consolas" w:cs="Consolas" w:eastAsia="Consolas" w:hAnsi="Consolas"/>
+                <w:color w:val="2B3442"/>
+                <w:sz w:val="19"/>
+                <w:szCs w:val="19"/>
+              </w:rPr>
+              <w:t xml:space="preserve">EmployeeApiVerifier</w:t>
+            </w:r>
+          </w:p>
+        </w:tc>
+        <w:tc>
+          <w:tcPr>
+            <w:tcW w:type="dxa" w:w="3876"/>
+            <w:tcBorders>
+              <w:top w:val="single" w:color="D6DBE4" w:sz="4"/>
+              <w:left w:val="single" w:color="D6DBE4" w:sz="4"/>
+              <w:bottom w:val="single" w:color="D6DBE4" w:sz="4"/>
+              <w:right w:val="single" w:color="D6DBE4" w:sz="4"/>
+            </w:tcBorders>
+            <w:tcMar>
+              <w:top w:type="dxa" w:w="70"/>
+              <w:left w:type="dxa" w:w="100"/>
+              <w:bottom w:type="dxa" w:w="70"/>
+              <w:right w:type="dxa" w:w="100"/>
+            </w:tcMar>
+          </w:tcPr>
+          <w:p>
+            <w:r>
+              <w:rPr>
+                <w:b/>
+                <w:bCs/>
+                <w:sz w:val="19"/>
+                <w:szCs w:val="19"/>
+              </w:rPr>
+              <w:t xml:space="preserve">Your</w:t>
+            </w:r>
+            <w:r>
+              <w:rPr>
+                <w:sz w:val="19"/>
+                <w:szCs w:val="19"/>
+              </w:rPr>
+              <w:t xml:space="preserve"> employee API client (user name + password → employee or null). </w:t>
+            </w:r>
+            <w:r>
+              <w:rPr>
+                <w:rFonts w:ascii="Consolas" w:cs="Consolas" w:eastAsia="Consolas" w:hAnsi="Consolas"/>
+                <w:color w:val="2B3442"/>
+                <w:sz w:val="19"/>
+                <w:szCs w:val="19"/>
+              </w:rPr>
+              <w:t xml:space="preserve">DevEmployeeAuthApi</w:t>
+            </w:r>
+            <w:r>
+              <w:rPr>
+                <w:sz w:val="19"/>
+                <w:szCs w:val="19"/>
+              </w:rPr>
+              <w:t xml:space="preserve"> for development.</w:t>
             </w:r>
           </w:p>
         </w:tc>
@@ -13808,7 +15056,7 @@
                 <w:sz w:val="19"/>
                 <w:szCs w:val="19"/>
               </w:rPr>
-              <w:t xml:space="preserve">Not found or wrong type → verify against dummy hash (same timing) → "Invalid username or password".</w:t>
+              <w:t xml:space="preserve">Not found or wrong type → "Invalid username or password" (padded to ≥ 1 s). Employees not in QPS never reach the API.</w:t>
             </w:r>
           </w:p>
         </w:tc>
@@ -14024,7 +15272,7 @@
                 <w:sz w:val="17"/>
                 <w:szCs w:val="17"/>
               </w:rPr>
-              <w:t xml:space="preserve">IPasswordHasher.VerifyPassword(password, hash)</w:t>
+              <w:t xml:space="preserve">ICredentialVerifier.VerifyAsync(user, password)</w:t>
             </w:r>
           </w:p>
         </w:tc>
@@ -14050,7 +15298,39 @@
                 <w:sz w:val="19"/>
                 <w:szCs w:val="19"/>
               </w:rPr>
-              <w:t xml:space="preserve">Your hasher.</w:t>
+              <w:t xml:space="preserve">Vendor: </w:t>
+            </w:r>
+            <w:r>
+              <w:rPr>
+                <w:rFonts w:ascii="Consolas" w:cs="Consolas" w:eastAsia="Consolas" w:hAnsi="Consolas"/>
+                <w:color w:val="2B3442"/>
+                <w:sz w:val="19"/>
+                <w:szCs w:val="19"/>
+              </w:rPr>
+              <w:t xml:space="preserve">IPasswordHasher.VerifyPassword</w:t>
+            </w:r>
+            <w:r>
+              <w:rPr>
+                <w:sz w:val="19"/>
+                <w:szCs w:val="19"/>
+              </w:rPr>
+              <w:t xml:space="preserve">. Employee: </w:t>
+            </w:r>
+            <w:r>
+              <w:rPr>
+                <w:rFonts w:ascii="Consolas" w:cs="Consolas" w:eastAsia="Consolas" w:hAnsi="Consolas"/>
+                <w:color w:val="2B3442"/>
+                <w:sz w:val="19"/>
+                <w:szCs w:val="19"/>
+              </w:rPr>
+              <w:t xml:space="preserve">IEmployeeAuthApi.AuthenticateAsync(userName, password)</w:t>
+            </w:r>
+            <w:r>
+              <w:rPr>
+                <w:sz w:val="19"/>
+                <w:szCs w:val="19"/>
+              </w:rPr>
+              <w:t xml:space="preserve">; API down → "temporarily unavailable", not counted.</w:t>
             </w:r>
           </w:p>
         </w:tc>

</xml_diff>